<commit_message>
Redesign morphology bonus: list format (morph — free/bound per line) + worked example
Replace two-column breakdown/labels with single Answer column using one morpheme
per line. Add completed example at top of assignment. Leave blank lines in student
version for digital entry.

Co-Authored-By: Claude Sonnet 4.6 <noreply@anthropic.com>
</commit_message>
<xml_diff>
--- a/Homework/Exams/ENGL 3110 - S26 - Morphology Bonus Assignment - Answer Key.docx
+++ b/Homework/Exams/ENGL 3110 - S26 - Morphology Bonus Assignment - Answer Key.docx
@@ -42,51 +42,70 @@
         <w:rPr>
           <w:sz w:val="22"/>
         </w:rPr>
-        <w:t>For each word in the table below, complete two columns:</w:t>
-      </w:r>
-    </w:p>
-    <w:p>
-      <w:r>
-        <w:rPr>
-          <w:b/>
-          <w:sz w:val="22"/>
-        </w:rPr>
-        <w:t xml:space="preserve">1. </w:t>
+        <w:t xml:space="preserve">For each word below, divide it into its component morphemes and label each morpheme as </w:t>
       </w:r>
       <w:r>
         <w:rPr>
           <w:b/>
           <w:sz w:val="22"/>
         </w:rPr>
-        <w:t xml:space="preserve">Morpheme Breakdown: </w:t>
+        <w:t>free</w:t>
       </w:r>
       <w:r>
         <w:rPr>
           <w:sz w:val="22"/>
         </w:rPr>
-        <w:t>Divide the word into its individual morphemes. Use + to separate them. Mark prefixes with a leading hyphen (un-) and suffixes with a trailing hyphen (-ness).</w:t>
-      </w:r>
-    </w:p>
-    <w:p>
-      <w:r>
-        <w:rPr>
-          <w:b/>
-          <w:sz w:val="22"/>
-        </w:rPr>
-        <w:t xml:space="preserve">2. </w:t>
+        <w:t xml:space="preserve"> (can stand alone as a word) or </w:t>
       </w:r>
       <w:r>
         <w:rPr>
           <w:b/>
           <w:sz w:val="22"/>
         </w:rPr>
-        <w:t xml:space="preserve">Free or Bound: </w:t>
+        <w:t>bound</w:t>
       </w:r>
       <w:r>
         <w:rPr>
           <w:sz w:val="22"/>
         </w:rPr>
-        <w:t>Label each morpheme as either free (can stand alone as a word) or bound (must attach to another morpheme). List labels in the same order as your breakdown.</w:t>
+        <w:t xml:space="preserve"> (must attach to another morpheme).</w:t>
+      </w:r>
+    </w:p>
+    <w:p>
+      <w:pPr>
+        <w:spacing w:before="0" w:after="120"/>
+      </w:pPr>
+      <w:r>
+        <w:rPr>
+          <w:sz w:val="22"/>
+        </w:rPr>
+        <w:t>List one morpheme per line in the Answer column. Mark prefixes with a trailing hyphen (</w:t>
+      </w:r>
+      <w:r>
+        <w:rPr>
+          <w:i/>
+          <w:sz w:val="22"/>
+        </w:rPr>
+        <w:t>un-</w:t>
+      </w:r>
+      <w:r>
+        <w:rPr>
+          <w:sz w:val="22"/>
+        </w:rPr>
+        <w:t>) and suffixes with a leading hyphen (</w:t>
+      </w:r>
+      <w:r>
+        <w:rPr>
+          <w:i/>
+          <w:sz w:val="22"/>
+        </w:rPr>
+        <w:t>-ness</w:t>
+      </w:r>
+      <w:r>
+        <w:rPr>
+          <w:sz w:val="22"/>
+        </w:rPr>
+        <w:t>).</w:t>
       </w:r>
     </w:p>
     <w:p>
@@ -96,9 +115,9 @@
       <w:r>
         <w:rPr>
           <w:b/>
-          <w:sz w:val="20"/>
+          <w:sz w:val="22"/>
         </w:rPr>
-        <w:t xml:space="preserve">Example: </w:t>
+        <w:t>Example (completed):</w:t>
       </w:r>
     </w:p>
     <w:tbl>
@@ -109,148 +128,15 @@
         <w:tblLook w:firstColumn="1" w:firstRow="1" w:lastColumn="0" w:lastRow="0" w:noHBand="0" w:noVBand="1" w:val="04A0"/>
       </w:tblPr>
       <w:tblGrid>
-        <w:gridCol w:w="2880"/>
-        <w:gridCol w:w="2880"/>
-        <w:gridCol w:w="2880"/>
+        <w:gridCol w:w="2160"/>
+        <w:gridCol w:w="2160"/>
+        <w:gridCol w:w="2160"/>
+        <w:gridCol w:w="2160"/>
       </w:tblGrid>
       <w:tr>
         <w:tc>
           <w:tcPr>
-            <w:tcW w:type="dxa" w:w="2880"/>
-            <w:shd w:fill="E8E8E8" w:val="clear"/>
-          </w:tcPr>
-          <w:p>
-            <w:r/>
-            <w:r>
-              <w:rPr>
-                <w:b/>
-                <w:sz w:val="20"/>
-              </w:rPr>
-              <w:t>Word</w:t>
-            </w:r>
-          </w:p>
-        </w:tc>
-        <w:tc>
-          <w:tcPr>
-            <w:tcW w:type="dxa" w:w="2880"/>
-            <w:shd w:fill="E8E8E8" w:val="clear"/>
-          </w:tcPr>
-          <w:p>
-            <w:r/>
-            <w:r>
-              <w:rPr>
-                <w:b/>
-                <w:sz w:val="20"/>
-              </w:rPr>
-              <w:t>Morpheme Breakdown</w:t>
-            </w:r>
-          </w:p>
-        </w:tc>
-        <w:tc>
-          <w:tcPr>
-            <w:tcW w:type="dxa" w:w="2880"/>
-            <w:shd w:fill="E8E8E8" w:val="clear"/>
-          </w:tcPr>
-          <w:p>
-            <w:r/>
-            <w:r>
-              <w:rPr>
-                <w:b/>
-                <w:sz w:val="20"/>
-              </w:rPr>
-              <w:t>Free or Bound?</w:t>
-            </w:r>
-          </w:p>
-        </w:tc>
-      </w:tr>
-      <w:tr>
-        <w:tc>
-          <w:tcPr>
-            <w:tcW w:type="dxa" w:w="2880"/>
-          </w:tcPr>
-          <w:p>
-            <w:r/>
-            <w:r>
-              <w:rPr>
-                <w:i/>
-                <w:sz w:val="20"/>
-              </w:rPr>
-              <w:t>unhelpful</w:t>
-            </w:r>
-          </w:p>
-        </w:tc>
-        <w:tc>
-          <w:tcPr>
-            <w:tcW w:type="dxa" w:w="2880"/>
-          </w:tcPr>
-          <w:p>
-            <w:r/>
-            <w:r>
-              <w:rPr>
-                <w:sz w:val="20"/>
-              </w:rPr>
-              <w:t>un- + help + -ful</w:t>
-            </w:r>
-          </w:p>
-        </w:tc>
-        <w:tc>
-          <w:tcPr>
-            <w:tcW w:type="dxa" w:w="2880"/>
-          </w:tcPr>
-          <w:p>
-            <w:r/>
-            <w:r>
-              <w:rPr>
-                <w:sz w:val="20"/>
-              </w:rPr>
-              <w:t>bound, free, bound</w:t>
-            </w:r>
-          </w:p>
-        </w:tc>
-      </w:tr>
-    </w:tbl>
-    <w:p>
-      <w:pPr>
-        <w:spacing w:before="80" w:after="80"/>
-      </w:pPr>
-    </w:p>
-    <w:p>
-      <w:pPr>
-        <w:spacing w:before="0" w:after="120"/>
-      </w:pPr>
-      <w:r>
-        <w:rPr>
-          <w:b/>
-          <w:sz w:val="20"/>
-        </w:rPr>
-        <w:t xml:space="preserve">Note: </w:t>
-      </w:r>
-      <w:r>
-        <w:rPr>
-          <w:i/>
-          <w:sz w:val="20"/>
-        </w:rPr>
-        <w:t>Italicized text in the Notes column explains any non-obvious analyses.</w:t>
-      </w:r>
-    </w:p>
-    <w:tbl>
-      <w:tblPr>
-        <w:tblStyle w:val="TableGrid"/>
-        <w:tblW w:type="auto" w:w="0"/>
-        <w:jc w:val="left"/>
-        <w:tblLook w:firstColumn="1" w:firstRow="1" w:lastColumn="0" w:lastRow="0" w:noHBand="0" w:noVBand="1" w:val="04A0"/>
-      </w:tblPr>
-      <w:tblGrid>
-        <w:gridCol w:w="1728"/>
-        <w:gridCol w:w="1728"/>
-        <w:gridCol w:w="1728"/>
-        <w:gridCol w:w="1728"/>
-        <w:gridCol w:w="1728"/>
-      </w:tblGrid>
-      <w:tr>
-        <w:tc>
-          <w:tcPr>
-            <w:tcW w:type="dxa" w:w="1728"/>
+            <w:tcW w:type="dxa" w:w="2160"/>
             <w:shd w:fill="E8E8E8" w:val="clear"/>
           </w:tcPr>
           <w:p>
@@ -269,7 +155,7 @@
         </w:tc>
         <w:tc>
           <w:tcPr>
-            <w:tcW w:type="dxa" w:w="1728"/>
+            <w:tcW w:type="dxa" w:w="2160"/>
             <w:shd w:fill="E8E8E8" w:val="clear"/>
           </w:tcPr>
           <w:p>
@@ -288,7 +174,7 @@
         </w:tc>
         <w:tc>
           <w:tcPr>
-            <w:tcW w:type="dxa" w:w="1728"/>
+            <w:tcW w:type="dxa" w:w="2160"/>
             <w:shd w:fill="E8E8E8" w:val="clear"/>
           </w:tcPr>
           <w:p>
@@ -301,32 +187,13 @@
                 <w:b/>
                 <w:sz w:val="20"/>
               </w:rPr>
-              <w:t>Morpheme Breakdown</w:t>
+              <w:t>Answer</w:t>
             </w:r>
           </w:p>
         </w:tc>
         <w:tc>
           <w:tcPr>
-            <w:tcW w:type="dxa" w:w="1728"/>
-            <w:shd w:fill="E8E8E8" w:val="clear"/>
-          </w:tcPr>
-          <w:p>
-            <w:pPr>
-              <w:jc w:val="left"/>
-            </w:pPr>
-            <w:r/>
-            <w:r>
-              <w:rPr>
-                <w:b/>
-                <w:sz w:val="20"/>
-              </w:rPr>
-              <w:t>Free or Bound?</w:t>
-            </w:r>
-          </w:p>
-        </w:tc>
-        <w:tc>
-          <w:tcPr>
-            <w:tcW w:type="dxa" w:w="1728"/>
+            <w:tcW w:type="dxa" w:w="2160"/>
             <w:shd w:fill="E8E8E8" w:val="clear"/>
           </w:tcPr>
           <w:p>
@@ -347,7 +214,205 @@
       <w:tr>
         <w:tc>
           <w:tcPr>
-            <w:tcW w:type="dxa" w:w="1728"/>
+            <w:tcW w:type="dxa" w:w="2160"/>
+          </w:tcPr>
+          <w:p>
+            <w:pPr>
+              <w:jc w:val="center"/>
+            </w:pPr>
+            <w:r/>
+            <w:r>
+              <w:rPr>
+                <w:sz w:val="20"/>
+              </w:rPr>
+              <w:t>—</w:t>
+            </w:r>
+          </w:p>
+        </w:tc>
+        <w:tc>
+          <w:tcPr>
+            <w:tcW w:type="dxa" w:w="2160"/>
+          </w:tcPr>
+          <w:p>
+            <w:r/>
+            <w:r>
+              <w:rPr>
+                <w:b/>
+                <w:sz w:val="20"/>
+              </w:rPr>
+              <w:t>unhelpful</w:t>
+            </w:r>
+          </w:p>
+        </w:tc>
+        <w:tc>
+          <w:tcPr>
+            <w:tcW w:type="dxa" w:w="2160"/>
+          </w:tcPr>
+          <w:p>
+            <w:pPr>
+              <w:jc w:val="left"/>
+            </w:pPr>
+            <w:r>
+              <w:rPr>
+                <w:b/>
+                <w:sz w:val="20"/>
+              </w:rPr>
+              <w:t>un-</w:t>
+            </w:r>
+            <w:r>
+              <w:rPr>
+                <w:sz w:val="20"/>
+              </w:rPr>
+              <w:t xml:space="preserve">  —  bound</w:t>
+            </w:r>
+          </w:p>
+          <w:p>
+            <w:pPr>
+              <w:jc w:val="left"/>
+            </w:pPr>
+            <w:r>
+              <w:rPr>
+                <w:b/>
+                <w:sz w:val="20"/>
+              </w:rPr>
+              <w:t>help</w:t>
+            </w:r>
+            <w:r>
+              <w:rPr>
+                <w:sz w:val="20"/>
+              </w:rPr>
+              <w:t xml:space="preserve">  —  free</w:t>
+            </w:r>
+          </w:p>
+          <w:p>
+            <w:pPr>
+              <w:jc w:val="left"/>
+            </w:pPr>
+            <w:r>
+              <w:rPr>
+                <w:b/>
+                <w:sz w:val="20"/>
+              </w:rPr>
+              <w:t>-ful</w:t>
+            </w:r>
+            <w:r>
+              <w:rPr>
+                <w:sz w:val="20"/>
+              </w:rPr>
+              <w:t xml:space="preserve">  —  bound</w:t>
+            </w:r>
+          </w:p>
+        </w:tc>
+        <w:tc>
+          <w:tcPr>
+            <w:tcW w:type="dxa" w:w="2160"/>
+          </w:tcPr>
+          <w:p>
+            <w:r/>
+          </w:p>
+        </w:tc>
+      </w:tr>
+    </w:tbl>
+    <w:p>
+      <w:pPr>
+        <w:spacing w:before="120" w:after="80"/>
+      </w:pPr>
+    </w:p>
+    <w:tbl>
+      <w:tblPr>
+        <w:tblStyle w:val="TableGrid"/>
+        <w:tblW w:type="auto" w:w="0"/>
+        <w:jc w:val="left"/>
+        <w:tblLook w:firstColumn="1" w:firstRow="1" w:lastColumn="0" w:lastRow="0" w:noHBand="0" w:noVBand="1" w:val="04A0"/>
+      </w:tblPr>
+      <w:tblGrid>
+        <w:gridCol w:w="2160"/>
+        <w:gridCol w:w="2160"/>
+        <w:gridCol w:w="2160"/>
+        <w:gridCol w:w="2160"/>
+      </w:tblGrid>
+      <w:tr>
+        <w:tc>
+          <w:tcPr>
+            <w:tcW w:type="dxa" w:w="2160"/>
+            <w:shd w:fill="E8E8E8" w:val="clear"/>
+          </w:tcPr>
+          <w:p>
+            <w:pPr>
+              <w:jc w:val="center"/>
+            </w:pPr>
+            <w:r/>
+            <w:r>
+              <w:rPr>
+                <w:b/>
+                <w:sz w:val="20"/>
+              </w:rPr>
+              <w:t>#</w:t>
+            </w:r>
+          </w:p>
+        </w:tc>
+        <w:tc>
+          <w:tcPr>
+            <w:tcW w:type="dxa" w:w="2160"/>
+            <w:shd w:fill="E8E8E8" w:val="clear"/>
+          </w:tcPr>
+          <w:p>
+            <w:pPr>
+              <w:jc w:val="left"/>
+            </w:pPr>
+            <w:r/>
+            <w:r>
+              <w:rPr>
+                <w:b/>
+                <w:sz w:val="20"/>
+              </w:rPr>
+              <w:t>Word</w:t>
+            </w:r>
+          </w:p>
+        </w:tc>
+        <w:tc>
+          <w:tcPr>
+            <w:tcW w:type="dxa" w:w="2160"/>
+            <w:shd w:fill="E8E8E8" w:val="clear"/>
+          </w:tcPr>
+          <w:p>
+            <w:pPr>
+              <w:jc w:val="left"/>
+            </w:pPr>
+            <w:r/>
+            <w:r>
+              <w:rPr>
+                <w:b/>
+                <w:sz w:val="20"/>
+              </w:rPr>
+              <w:t>Answer</w:t>
+            </w:r>
+          </w:p>
+        </w:tc>
+        <w:tc>
+          <w:tcPr>
+            <w:tcW w:type="dxa" w:w="2160"/>
+            <w:shd w:fill="E8E8E8" w:val="clear"/>
+          </w:tcPr>
+          <w:p>
+            <w:pPr>
+              <w:jc w:val="left"/>
+            </w:pPr>
+            <w:r/>
+            <w:r>
+              <w:rPr>
+                <w:b/>
+                <w:sz w:val="20"/>
+              </w:rPr>
+              <w:t>Notes</w:t>
+            </w:r>
+          </w:p>
+        </w:tc>
+      </w:tr>
+      <w:tr>
+        <w:tc>
+          <w:tcPr>
+            <w:tcW w:type="dxa" w:w="2160"/>
           </w:tcPr>
           <w:p>
             <w:pPr>
@@ -364,7 +429,7 @@
         </w:tc>
         <w:tc>
           <w:tcPr>
-            <w:tcW w:type="dxa" w:w="1728"/>
+            <w:tcW w:type="dxa" w:w="2160"/>
           </w:tcPr>
           <w:p>
             <w:r/>
@@ -379,35 +444,48 @@
         </w:tc>
         <w:tc>
           <w:tcPr>
-            <w:tcW w:type="dxa" w:w="1728"/>
+            <w:tcW w:type="dxa" w:w="2160"/>
           </w:tcPr>
           <w:p>
-            <w:r/>
+            <w:pPr>
+              <w:jc w:val="left"/>
+            </w:pPr>
+            <w:r>
+              <w:rPr>
+                <w:b/>
+                <w:sz w:val="20"/>
+              </w:rPr>
+              <w:t>play</w:t>
+            </w:r>
             <w:r>
               <w:rPr>
                 <w:sz w:val="20"/>
               </w:rPr>
-              <w:t>play + -ful</w:t>
+              <w:t xml:space="preserve">  —  free</w:t>
+            </w:r>
+          </w:p>
+          <w:p>
+            <w:pPr>
+              <w:jc w:val="left"/>
+            </w:pPr>
+            <w:r>
+              <w:rPr>
+                <w:b/>
+                <w:sz w:val="20"/>
+              </w:rPr>
+              <w:t>-ful</w:t>
+            </w:r>
+            <w:r>
+              <w:rPr>
+                <w:sz w:val="20"/>
+              </w:rPr>
+              <w:t xml:space="preserve">  —  bound</w:t>
             </w:r>
           </w:p>
         </w:tc>
         <w:tc>
           <w:tcPr>
-            <w:tcW w:type="dxa" w:w="1728"/>
-          </w:tcPr>
-          <w:p>
-            <w:r/>
-            <w:r>
-              <w:rPr>
-                <w:sz w:val="20"/>
-              </w:rPr>
-              <w:t>free, bound</w:t>
-            </w:r>
-          </w:p>
-        </w:tc>
-        <w:tc>
-          <w:tcPr>
-            <w:tcW w:type="dxa" w:w="1728"/>
+            <w:tcW w:type="dxa" w:w="2160"/>
           </w:tcPr>
           <w:p>
             <w:r/>
@@ -417,7 +495,7 @@
       <w:tr>
         <w:tc>
           <w:tcPr>
-            <w:tcW w:type="dxa" w:w="1728"/>
+            <w:tcW w:type="dxa" w:w="2160"/>
             <w:shd w:fill="F5F5F5" w:val="clear"/>
           </w:tcPr>
           <w:p>
@@ -435,7 +513,7 @@
         </w:tc>
         <w:tc>
           <w:tcPr>
-            <w:tcW w:type="dxa" w:w="1728"/>
+            <w:tcW w:type="dxa" w:w="2160"/>
             <w:shd w:fill="F5F5F5" w:val="clear"/>
           </w:tcPr>
           <w:p>
@@ -451,37 +529,49 @@
         </w:tc>
         <w:tc>
           <w:tcPr>
-            <w:tcW w:type="dxa" w:w="1728"/>
+            <w:tcW w:type="dxa" w:w="2160"/>
             <w:shd w:fill="F5F5F5" w:val="clear"/>
           </w:tcPr>
           <w:p>
-            <w:r/>
+            <w:pPr>
+              <w:jc w:val="left"/>
+            </w:pPr>
+            <w:r>
+              <w:rPr>
+                <w:b/>
+                <w:sz w:val="20"/>
+              </w:rPr>
+              <w:t>dark</w:t>
+            </w:r>
             <w:r>
               <w:rPr>
                 <w:sz w:val="20"/>
               </w:rPr>
-              <w:t>dark + -ness</w:t>
+              <w:t xml:space="preserve">  —  free</w:t>
+            </w:r>
+          </w:p>
+          <w:p>
+            <w:pPr>
+              <w:jc w:val="left"/>
+            </w:pPr>
+            <w:r>
+              <w:rPr>
+                <w:b/>
+                <w:sz w:val="20"/>
+              </w:rPr>
+              <w:t>-ness</w:t>
+            </w:r>
+            <w:r>
+              <w:rPr>
+                <w:sz w:val="20"/>
+              </w:rPr>
+              <w:t xml:space="preserve">  —  bound</w:t>
             </w:r>
           </w:p>
         </w:tc>
         <w:tc>
           <w:tcPr>
-            <w:tcW w:type="dxa" w:w="1728"/>
-            <w:shd w:fill="F5F5F5" w:val="clear"/>
-          </w:tcPr>
-          <w:p>
-            <w:r/>
-            <w:r>
-              <w:rPr>
-                <w:sz w:val="20"/>
-              </w:rPr>
-              <w:t>free, bound</w:t>
-            </w:r>
-          </w:p>
-        </w:tc>
-        <w:tc>
-          <w:tcPr>
-            <w:tcW w:type="dxa" w:w="1728"/>
+            <w:tcW w:type="dxa" w:w="2160"/>
             <w:shd w:fill="F5F5F5" w:val="clear"/>
           </w:tcPr>
           <w:p>
@@ -492,7 +582,7 @@
       <w:tr>
         <w:tc>
           <w:tcPr>
-            <w:tcW w:type="dxa" w:w="1728"/>
+            <w:tcW w:type="dxa" w:w="2160"/>
           </w:tcPr>
           <w:p>
             <w:pPr>
@@ -509,7 +599,7 @@
         </w:tc>
         <w:tc>
           <w:tcPr>
-            <w:tcW w:type="dxa" w:w="1728"/>
+            <w:tcW w:type="dxa" w:w="2160"/>
           </w:tcPr>
           <w:p>
             <w:r/>
@@ -524,35 +614,48 @@
         </w:tc>
         <w:tc>
           <w:tcPr>
-            <w:tcW w:type="dxa" w:w="1728"/>
+            <w:tcW w:type="dxa" w:w="2160"/>
           </w:tcPr>
           <w:p>
-            <w:r/>
+            <w:pPr>
+              <w:jc w:val="left"/>
+            </w:pPr>
+            <w:r>
+              <w:rPr>
+                <w:b/>
+                <w:sz w:val="20"/>
+              </w:rPr>
+              <w:t>quick</w:t>
+            </w:r>
             <w:r>
               <w:rPr>
                 <w:sz w:val="20"/>
               </w:rPr>
-              <w:t>quick + -ly</w:t>
+              <w:t xml:space="preserve">  —  free</w:t>
+            </w:r>
+          </w:p>
+          <w:p>
+            <w:pPr>
+              <w:jc w:val="left"/>
+            </w:pPr>
+            <w:r>
+              <w:rPr>
+                <w:b/>
+                <w:sz w:val="20"/>
+              </w:rPr>
+              <w:t>-ly</w:t>
+            </w:r>
+            <w:r>
+              <w:rPr>
+                <w:sz w:val="20"/>
+              </w:rPr>
+              <w:t xml:space="preserve">  —  bound</w:t>
             </w:r>
           </w:p>
         </w:tc>
         <w:tc>
           <w:tcPr>
-            <w:tcW w:type="dxa" w:w="1728"/>
-          </w:tcPr>
-          <w:p>
-            <w:r/>
-            <w:r>
-              <w:rPr>
-                <w:sz w:val="20"/>
-              </w:rPr>
-              <w:t>free, bound</w:t>
-            </w:r>
-          </w:p>
-        </w:tc>
-        <w:tc>
-          <w:tcPr>
-            <w:tcW w:type="dxa" w:w="1728"/>
+            <w:tcW w:type="dxa" w:w="2160"/>
           </w:tcPr>
           <w:p>
             <w:r/>
@@ -562,7 +665,7 @@
       <w:tr>
         <w:tc>
           <w:tcPr>
-            <w:tcW w:type="dxa" w:w="1728"/>
+            <w:tcW w:type="dxa" w:w="2160"/>
             <w:shd w:fill="F5F5F5" w:val="clear"/>
           </w:tcPr>
           <w:p>
@@ -580,7 +683,7 @@
         </w:tc>
         <w:tc>
           <w:tcPr>
-            <w:tcW w:type="dxa" w:w="1728"/>
+            <w:tcW w:type="dxa" w:w="2160"/>
             <w:shd w:fill="F5F5F5" w:val="clear"/>
           </w:tcPr>
           <w:p>
@@ -596,37 +699,49 @@
         </w:tc>
         <w:tc>
           <w:tcPr>
-            <w:tcW w:type="dxa" w:w="1728"/>
+            <w:tcW w:type="dxa" w:w="2160"/>
             <w:shd w:fill="F5F5F5" w:val="clear"/>
           </w:tcPr>
           <w:p>
-            <w:r/>
+            <w:pPr>
+              <w:jc w:val="left"/>
+            </w:pPr>
+            <w:r>
+              <w:rPr>
+                <w:b/>
+                <w:sz w:val="20"/>
+              </w:rPr>
+              <w:t>kind</w:t>
+            </w:r>
             <w:r>
               <w:rPr>
                 <w:sz w:val="20"/>
               </w:rPr>
-              <w:t>kind + -ness</w:t>
+              <w:t xml:space="preserve">  —  free</w:t>
+            </w:r>
+          </w:p>
+          <w:p>
+            <w:pPr>
+              <w:jc w:val="left"/>
+            </w:pPr>
+            <w:r>
+              <w:rPr>
+                <w:b/>
+                <w:sz w:val="20"/>
+              </w:rPr>
+              <w:t>-ness</w:t>
+            </w:r>
+            <w:r>
+              <w:rPr>
+                <w:sz w:val="20"/>
+              </w:rPr>
+              <w:t xml:space="preserve">  —  bound</w:t>
             </w:r>
           </w:p>
         </w:tc>
         <w:tc>
           <w:tcPr>
-            <w:tcW w:type="dxa" w:w="1728"/>
-            <w:shd w:fill="F5F5F5" w:val="clear"/>
-          </w:tcPr>
-          <w:p>
-            <w:r/>
-            <w:r>
-              <w:rPr>
-                <w:sz w:val="20"/>
-              </w:rPr>
-              <w:t>free, bound</w:t>
-            </w:r>
-          </w:p>
-        </w:tc>
-        <w:tc>
-          <w:tcPr>
-            <w:tcW w:type="dxa" w:w="1728"/>
+            <w:tcW w:type="dxa" w:w="2160"/>
             <w:shd w:fill="F5F5F5" w:val="clear"/>
           </w:tcPr>
           <w:p>
@@ -637,7 +752,7 @@
       <w:tr>
         <w:tc>
           <w:tcPr>
-            <w:tcW w:type="dxa" w:w="1728"/>
+            <w:tcW w:type="dxa" w:w="2160"/>
           </w:tcPr>
           <w:p>
             <w:pPr>
@@ -654,7 +769,7 @@
         </w:tc>
         <w:tc>
           <w:tcPr>
-            <w:tcW w:type="dxa" w:w="1728"/>
+            <w:tcW w:type="dxa" w:w="2160"/>
           </w:tcPr>
           <w:p>
             <w:r/>
@@ -669,35 +784,48 @@
         </w:tc>
         <w:tc>
           <w:tcPr>
-            <w:tcW w:type="dxa" w:w="1728"/>
+            <w:tcW w:type="dxa" w:w="2160"/>
           </w:tcPr>
           <w:p>
-            <w:r/>
+            <w:pPr>
+              <w:jc w:val="left"/>
+            </w:pPr>
+            <w:r>
+              <w:rPr>
+                <w:b/>
+                <w:sz w:val="20"/>
+              </w:rPr>
+              <w:t>book</w:t>
+            </w:r>
             <w:r>
               <w:rPr>
                 <w:sz w:val="20"/>
               </w:rPr>
-              <w:t>book + case</w:t>
+              <w:t xml:space="preserve">  —  free</w:t>
+            </w:r>
+          </w:p>
+          <w:p>
+            <w:pPr>
+              <w:jc w:val="left"/>
+            </w:pPr>
+            <w:r>
+              <w:rPr>
+                <w:b/>
+                <w:sz w:val="20"/>
+              </w:rPr>
+              <w:t>case</w:t>
+            </w:r>
+            <w:r>
+              <w:rPr>
+                <w:sz w:val="20"/>
+              </w:rPr>
+              <w:t xml:space="preserve">  —  free</w:t>
             </w:r>
           </w:p>
         </w:tc>
         <w:tc>
           <w:tcPr>
-            <w:tcW w:type="dxa" w:w="1728"/>
-          </w:tcPr>
-          <w:p>
-            <w:r/>
-            <w:r>
-              <w:rPr>
-                <w:sz w:val="20"/>
-              </w:rPr>
-              <w:t>free, free</w:t>
-            </w:r>
-          </w:p>
-        </w:tc>
-        <w:tc>
-          <w:tcPr>
-            <w:tcW w:type="dxa" w:w="1728"/>
+            <w:tcW w:type="dxa" w:w="2160"/>
           </w:tcPr>
           <w:p>
             <w:r/>
@@ -714,7 +842,7 @@
       <w:tr>
         <w:tc>
           <w:tcPr>
-            <w:tcW w:type="dxa" w:w="1728"/>
+            <w:tcW w:type="dxa" w:w="2160"/>
             <w:shd w:fill="F5F5F5" w:val="clear"/>
           </w:tcPr>
           <w:p>
@@ -732,7 +860,7 @@
         </w:tc>
         <w:tc>
           <w:tcPr>
-            <w:tcW w:type="dxa" w:w="1728"/>
+            <w:tcW w:type="dxa" w:w="2160"/>
             <w:shd w:fill="F5F5F5" w:val="clear"/>
           </w:tcPr>
           <w:p>
@@ -748,37 +876,49 @@
         </w:tc>
         <w:tc>
           <w:tcPr>
-            <w:tcW w:type="dxa" w:w="1728"/>
+            <w:tcW w:type="dxa" w:w="2160"/>
             <w:shd w:fill="F5F5F5" w:val="clear"/>
           </w:tcPr>
           <w:p>
-            <w:r/>
+            <w:pPr>
+              <w:jc w:val="left"/>
+            </w:pPr>
+            <w:r>
+              <w:rPr>
+                <w:b/>
+                <w:sz w:val="20"/>
+              </w:rPr>
+              <w:t>truth</w:t>
+            </w:r>
             <w:r>
               <w:rPr>
                 <w:sz w:val="20"/>
               </w:rPr>
-              <w:t>truth + -ful</w:t>
+              <w:t xml:space="preserve">  —  free</w:t>
+            </w:r>
+          </w:p>
+          <w:p>
+            <w:pPr>
+              <w:jc w:val="left"/>
+            </w:pPr>
+            <w:r>
+              <w:rPr>
+                <w:b/>
+                <w:sz w:val="20"/>
+              </w:rPr>
+              <w:t>-ful</w:t>
+            </w:r>
+            <w:r>
+              <w:rPr>
+                <w:sz w:val="20"/>
+              </w:rPr>
+              <w:t xml:space="preserve">  —  bound</w:t>
             </w:r>
           </w:p>
         </w:tc>
         <w:tc>
           <w:tcPr>
-            <w:tcW w:type="dxa" w:w="1728"/>
-            <w:shd w:fill="F5F5F5" w:val="clear"/>
-          </w:tcPr>
-          <w:p>
-            <w:r/>
-            <w:r>
-              <w:rPr>
-                <w:sz w:val="20"/>
-              </w:rPr>
-              <w:t>free, bound</w:t>
-            </w:r>
-          </w:p>
-        </w:tc>
-        <w:tc>
-          <w:tcPr>
-            <w:tcW w:type="dxa" w:w="1728"/>
+            <w:tcW w:type="dxa" w:w="2160"/>
             <w:shd w:fill="F5F5F5" w:val="clear"/>
           </w:tcPr>
           <w:p>
@@ -789,7 +929,7 @@
       <w:tr>
         <w:tc>
           <w:tcPr>
-            <w:tcW w:type="dxa" w:w="1728"/>
+            <w:tcW w:type="dxa" w:w="2160"/>
           </w:tcPr>
           <w:p>
             <w:pPr>
@@ -806,7 +946,7 @@
         </w:tc>
         <w:tc>
           <w:tcPr>
-            <w:tcW w:type="dxa" w:w="1728"/>
+            <w:tcW w:type="dxa" w:w="2160"/>
           </w:tcPr>
           <w:p>
             <w:r/>
@@ -821,35 +961,48 @@
         </w:tc>
         <w:tc>
           <w:tcPr>
-            <w:tcW w:type="dxa" w:w="1728"/>
+            <w:tcW w:type="dxa" w:w="2160"/>
           </w:tcPr>
           <w:p>
-            <w:r/>
+            <w:pPr>
+              <w:jc w:val="left"/>
+            </w:pPr>
+            <w:r>
+              <w:rPr>
+                <w:b/>
+                <w:sz w:val="20"/>
+              </w:rPr>
+              <w:t>power</w:t>
+            </w:r>
             <w:r>
               <w:rPr>
                 <w:sz w:val="20"/>
               </w:rPr>
-              <w:t>power + -less</w:t>
+              <w:t xml:space="preserve">  —  free</w:t>
+            </w:r>
+          </w:p>
+          <w:p>
+            <w:pPr>
+              <w:jc w:val="left"/>
+            </w:pPr>
+            <w:r>
+              <w:rPr>
+                <w:b/>
+                <w:sz w:val="20"/>
+              </w:rPr>
+              <w:t>-less</w:t>
+            </w:r>
+            <w:r>
+              <w:rPr>
+                <w:sz w:val="20"/>
+              </w:rPr>
+              <w:t xml:space="preserve">  —  bound</w:t>
             </w:r>
           </w:p>
         </w:tc>
         <w:tc>
           <w:tcPr>
-            <w:tcW w:type="dxa" w:w="1728"/>
-          </w:tcPr>
-          <w:p>
-            <w:r/>
-            <w:r>
-              <w:rPr>
-                <w:sz w:val="20"/>
-              </w:rPr>
-              <w:t>free, bound</w:t>
-            </w:r>
-          </w:p>
-        </w:tc>
-        <w:tc>
-          <w:tcPr>
-            <w:tcW w:type="dxa" w:w="1728"/>
+            <w:tcW w:type="dxa" w:w="2160"/>
           </w:tcPr>
           <w:p>
             <w:r/>
@@ -859,7 +1012,7 @@
       <w:tr>
         <w:tc>
           <w:tcPr>
-            <w:tcW w:type="dxa" w:w="1728"/>
+            <w:tcW w:type="dxa" w:w="2160"/>
             <w:shd w:fill="F5F5F5" w:val="clear"/>
           </w:tcPr>
           <w:p>
@@ -877,7 +1030,7 @@
         </w:tc>
         <w:tc>
           <w:tcPr>
-            <w:tcW w:type="dxa" w:w="1728"/>
+            <w:tcW w:type="dxa" w:w="2160"/>
             <w:shd w:fill="F5F5F5" w:val="clear"/>
           </w:tcPr>
           <w:p>
@@ -893,37 +1046,49 @@
         </w:tc>
         <w:tc>
           <w:tcPr>
-            <w:tcW w:type="dxa" w:w="1728"/>
+            <w:tcW w:type="dxa" w:w="2160"/>
             <w:shd w:fill="F5F5F5" w:val="clear"/>
           </w:tcPr>
           <w:p>
-            <w:r/>
+            <w:pPr>
+              <w:jc w:val="left"/>
+            </w:pPr>
+            <w:r>
+              <w:rPr>
+                <w:b/>
+                <w:sz w:val="20"/>
+              </w:rPr>
+              <w:t>mis-</w:t>
+            </w:r>
             <w:r>
               <w:rPr>
                 <w:sz w:val="20"/>
               </w:rPr>
-              <w:t>mis- + understand</w:t>
+              <w:t xml:space="preserve">  —  bound</w:t>
+            </w:r>
+          </w:p>
+          <w:p>
+            <w:pPr>
+              <w:jc w:val="left"/>
+            </w:pPr>
+            <w:r>
+              <w:rPr>
+                <w:b/>
+                <w:sz w:val="20"/>
+              </w:rPr>
+              <w:t>understand</w:t>
+            </w:r>
+            <w:r>
+              <w:rPr>
+                <w:sz w:val="20"/>
+              </w:rPr>
+              <w:t xml:space="preserve">  —  free</w:t>
             </w:r>
           </w:p>
         </w:tc>
         <w:tc>
           <w:tcPr>
-            <w:tcW w:type="dxa" w:w="1728"/>
-            <w:shd w:fill="F5F5F5" w:val="clear"/>
-          </w:tcPr>
-          <w:p>
-            <w:r/>
-            <w:r>
-              <w:rPr>
-                <w:sz w:val="20"/>
-              </w:rPr>
-              <w:t>bound, free</w:t>
-            </w:r>
-          </w:p>
-        </w:tc>
-        <w:tc>
-          <w:tcPr>
-            <w:tcW w:type="dxa" w:w="1728"/>
+            <w:tcW w:type="dxa" w:w="2160"/>
             <w:shd w:fill="F5F5F5" w:val="clear"/>
           </w:tcPr>
           <w:p>
@@ -941,7 +1106,7 @@
       <w:tr>
         <w:tc>
           <w:tcPr>
-            <w:tcW w:type="dxa" w:w="1728"/>
+            <w:tcW w:type="dxa" w:w="2160"/>
           </w:tcPr>
           <w:p>
             <w:pPr>
@@ -958,7 +1123,7 @@
         </w:tc>
         <w:tc>
           <w:tcPr>
-            <w:tcW w:type="dxa" w:w="1728"/>
+            <w:tcW w:type="dxa" w:w="2160"/>
           </w:tcPr>
           <w:p>
             <w:r/>
@@ -973,35 +1138,66 @@
         </w:tc>
         <w:tc>
           <w:tcPr>
-            <w:tcW w:type="dxa" w:w="1728"/>
+            <w:tcW w:type="dxa" w:w="2160"/>
           </w:tcPr>
           <w:p>
-            <w:r/>
+            <w:pPr>
+              <w:jc w:val="left"/>
+            </w:pPr>
+            <w:r>
+              <w:rPr>
+                <w:b/>
+                <w:sz w:val="20"/>
+              </w:rPr>
+              <w:t>re-</w:t>
+            </w:r>
             <w:r>
               <w:rPr>
                 <w:sz w:val="20"/>
               </w:rPr>
-              <w:t>re- + build + -ing</w:t>
+              <w:t xml:space="preserve">  —  bound</w:t>
+            </w:r>
+          </w:p>
+          <w:p>
+            <w:pPr>
+              <w:jc w:val="left"/>
+            </w:pPr>
+            <w:r>
+              <w:rPr>
+                <w:b/>
+                <w:sz w:val="20"/>
+              </w:rPr>
+              <w:t>build</w:t>
+            </w:r>
+            <w:r>
+              <w:rPr>
+                <w:sz w:val="20"/>
+              </w:rPr>
+              <w:t xml:space="preserve">  —  free</w:t>
+            </w:r>
+          </w:p>
+          <w:p>
+            <w:pPr>
+              <w:jc w:val="left"/>
+            </w:pPr>
+            <w:r>
+              <w:rPr>
+                <w:b/>
+                <w:sz w:val="20"/>
+              </w:rPr>
+              <w:t>-ing</w:t>
+            </w:r>
+            <w:r>
+              <w:rPr>
+                <w:sz w:val="20"/>
+              </w:rPr>
+              <w:t xml:space="preserve">  —  bound</w:t>
             </w:r>
           </w:p>
         </w:tc>
         <w:tc>
           <w:tcPr>
-            <w:tcW w:type="dxa" w:w="1728"/>
-          </w:tcPr>
-          <w:p>
-            <w:r/>
-            <w:r>
-              <w:rPr>
-                <w:sz w:val="20"/>
-              </w:rPr>
-              <w:t>bound, free, bound</w:t>
-            </w:r>
-          </w:p>
-        </w:tc>
-        <w:tc>
-          <w:tcPr>
-            <w:tcW w:type="dxa" w:w="1728"/>
+            <w:tcW w:type="dxa" w:w="2160"/>
           </w:tcPr>
           <w:p>
             <w:r/>
@@ -1011,7 +1207,7 @@
       <w:tr>
         <w:tc>
           <w:tcPr>
-            <w:tcW w:type="dxa" w:w="1728"/>
+            <w:tcW w:type="dxa" w:w="2160"/>
             <w:shd w:fill="F5F5F5" w:val="clear"/>
           </w:tcPr>
           <w:p>
@@ -1029,7 +1225,7 @@
         </w:tc>
         <w:tc>
           <w:tcPr>
-            <w:tcW w:type="dxa" w:w="1728"/>
+            <w:tcW w:type="dxa" w:w="2160"/>
             <w:shd w:fill="F5F5F5" w:val="clear"/>
           </w:tcPr>
           <w:p>
@@ -1045,37 +1241,67 @@
         </w:tc>
         <w:tc>
           <w:tcPr>
-            <w:tcW w:type="dxa" w:w="1728"/>
+            <w:tcW w:type="dxa" w:w="2160"/>
             <w:shd w:fill="F5F5F5" w:val="clear"/>
           </w:tcPr>
           <w:p>
-            <w:r/>
+            <w:pPr>
+              <w:jc w:val="left"/>
+            </w:pPr>
+            <w:r>
+              <w:rPr>
+                <w:b/>
+                <w:sz w:val="20"/>
+              </w:rPr>
+              <w:t>teach</w:t>
+            </w:r>
             <w:r>
               <w:rPr>
                 <w:sz w:val="20"/>
               </w:rPr>
-              <w:t>teach + -er + -s</w:t>
+              <w:t xml:space="preserve">  —  free</w:t>
+            </w:r>
+          </w:p>
+          <w:p>
+            <w:pPr>
+              <w:jc w:val="left"/>
+            </w:pPr>
+            <w:r>
+              <w:rPr>
+                <w:b/>
+                <w:sz w:val="20"/>
+              </w:rPr>
+              <w:t>-er</w:t>
+            </w:r>
+            <w:r>
+              <w:rPr>
+                <w:sz w:val="20"/>
+              </w:rPr>
+              <w:t xml:space="preserve">  —  bound</w:t>
+            </w:r>
+          </w:p>
+          <w:p>
+            <w:pPr>
+              <w:jc w:val="left"/>
+            </w:pPr>
+            <w:r>
+              <w:rPr>
+                <w:b/>
+                <w:sz w:val="20"/>
+              </w:rPr>
+              <w:t>-s</w:t>
+            </w:r>
+            <w:r>
+              <w:rPr>
+                <w:sz w:val="20"/>
+              </w:rPr>
+              <w:t xml:space="preserve">  —  bound</w:t>
             </w:r>
           </w:p>
         </w:tc>
         <w:tc>
           <w:tcPr>
-            <w:tcW w:type="dxa" w:w="1728"/>
-            <w:shd w:fill="F5F5F5" w:val="clear"/>
-          </w:tcPr>
-          <w:p>
-            <w:r/>
-            <w:r>
-              <w:rPr>
-                <w:sz w:val="20"/>
-              </w:rPr>
-              <w:t>free, bound, bound</w:t>
-            </w:r>
-          </w:p>
-        </w:tc>
-        <w:tc>
-          <w:tcPr>
-            <w:tcW w:type="dxa" w:w="1728"/>
+            <w:tcW w:type="dxa" w:w="2160"/>
             <w:shd w:fill="F5F5F5" w:val="clear"/>
           </w:tcPr>
           <w:p>
@@ -1086,7 +1312,7 @@
       <w:tr>
         <w:tc>
           <w:tcPr>
-            <w:tcW w:type="dxa" w:w="1728"/>
+            <w:tcW w:type="dxa" w:w="2160"/>
           </w:tcPr>
           <w:p>
             <w:pPr>
@@ -1103,7 +1329,7 @@
         </w:tc>
         <w:tc>
           <w:tcPr>
-            <w:tcW w:type="dxa" w:w="1728"/>
+            <w:tcW w:type="dxa" w:w="2160"/>
           </w:tcPr>
           <w:p>
             <w:r/>
@@ -1118,35 +1344,66 @@
         </w:tc>
         <w:tc>
           <w:tcPr>
-            <w:tcW w:type="dxa" w:w="1728"/>
+            <w:tcW w:type="dxa" w:w="2160"/>
           </w:tcPr>
           <w:p>
-            <w:r/>
+            <w:pPr>
+              <w:jc w:val="left"/>
+            </w:pPr>
+            <w:r>
+              <w:rPr>
+                <w:b/>
+                <w:sz w:val="20"/>
+              </w:rPr>
+              <w:t>care</w:t>
+            </w:r>
             <w:r>
               <w:rPr>
                 <w:sz w:val="20"/>
               </w:rPr>
-              <w:t>care + -ful + -ly</w:t>
+              <w:t xml:space="preserve">  —  free</w:t>
+            </w:r>
+          </w:p>
+          <w:p>
+            <w:pPr>
+              <w:jc w:val="left"/>
+            </w:pPr>
+            <w:r>
+              <w:rPr>
+                <w:b/>
+                <w:sz w:val="20"/>
+              </w:rPr>
+              <w:t>-ful</w:t>
+            </w:r>
+            <w:r>
+              <w:rPr>
+                <w:sz w:val="20"/>
+              </w:rPr>
+              <w:t xml:space="preserve">  —  bound</w:t>
+            </w:r>
+          </w:p>
+          <w:p>
+            <w:pPr>
+              <w:jc w:val="left"/>
+            </w:pPr>
+            <w:r>
+              <w:rPr>
+                <w:b/>
+                <w:sz w:val="20"/>
+              </w:rPr>
+              <w:t>-ly</w:t>
+            </w:r>
+            <w:r>
+              <w:rPr>
+                <w:sz w:val="20"/>
+              </w:rPr>
+              <w:t xml:space="preserve">  —  bound</w:t>
             </w:r>
           </w:p>
         </w:tc>
         <w:tc>
           <w:tcPr>
-            <w:tcW w:type="dxa" w:w="1728"/>
-          </w:tcPr>
-          <w:p>
-            <w:r/>
-            <w:r>
-              <w:rPr>
-                <w:sz w:val="20"/>
-              </w:rPr>
-              <w:t>free, bound, bound</w:t>
-            </w:r>
-          </w:p>
-        </w:tc>
-        <w:tc>
-          <w:tcPr>
-            <w:tcW w:type="dxa" w:w="1728"/>
+            <w:tcW w:type="dxa" w:w="2160"/>
           </w:tcPr>
           <w:p>
             <w:r/>
@@ -1156,7 +1413,7 @@
       <w:tr>
         <w:tc>
           <w:tcPr>
-            <w:tcW w:type="dxa" w:w="1728"/>
+            <w:tcW w:type="dxa" w:w="2160"/>
             <w:shd w:fill="F5F5F5" w:val="clear"/>
           </w:tcPr>
           <w:p>
@@ -1174,7 +1431,7 @@
         </w:tc>
         <w:tc>
           <w:tcPr>
-            <w:tcW w:type="dxa" w:w="1728"/>
+            <w:tcW w:type="dxa" w:w="2160"/>
             <w:shd w:fill="F5F5F5" w:val="clear"/>
           </w:tcPr>
           <w:p>
@@ -1190,37 +1447,67 @@
         </w:tc>
         <w:tc>
           <w:tcPr>
-            <w:tcW w:type="dxa" w:w="1728"/>
+            <w:tcW w:type="dxa" w:w="2160"/>
             <w:shd w:fill="F5F5F5" w:val="clear"/>
           </w:tcPr>
           <w:p>
-            <w:r/>
+            <w:pPr>
+              <w:jc w:val="left"/>
+            </w:pPr>
+            <w:r>
+              <w:rPr>
+                <w:b/>
+                <w:sz w:val="20"/>
+              </w:rPr>
+              <w:t>un-</w:t>
+            </w:r>
             <w:r>
               <w:rPr>
                 <w:sz w:val="20"/>
               </w:rPr>
-              <w:t>un- + friend + -ly</w:t>
+              <w:t xml:space="preserve">  —  bound</w:t>
+            </w:r>
+          </w:p>
+          <w:p>
+            <w:pPr>
+              <w:jc w:val="left"/>
+            </w:pPr>
+            <w:r>
+              <w:rPr>
+                <w:b/>
+                <w:sz w:val="20"/>
+              </w:rPr>
+              <w:t>friend</w:t>
+            </w:r>
+            <w:r>
+              <w:rPr>
+                <w:sz w:val="20"/>
+              </w:rPr>
+              <w:t xml:space="preserve">  —  free</w:t>
+            </w:r>
+          </w:p>
+          <w:p>
+            <w:pPr>
+              <w:jc w:val="left"/>
+            </w:pPr>
+            <w:r>
+              <w:rPr>
+                <w:b/>
+                <w:sz w:val="20"/>
+              </w:rPr>
+              <w:t>-ly</w:t>
+            </w:r>
+            <w:r>
+              <w:rPr>
+                <w:sz w:val="20"/>
+              </w:rPr>
+              <w:t xml:space="preserve">  —  bound</w:t>
             </w:r>
           </w:p>
         </w:tc>
         <w:tc>
           <w:tcPr>
-            <w:tcW w:type="dxa" w:w="1728"/>
-            <w:shd w:fill="F5F5F5" w:val="clear"/>
-          </w:tcPr>
-          <w:p>
-            <w:r/>
-            <w:r>
-              <w:rPr>
-                <w:sz w:val="20"/>
-              </w:rPr>
-              <w:t>bound, free, bound</w:t>
-            </w:r>
-          </w:p>
-        </w:tc>
-        <w:tc>
-          <w:tcPr>
-            <w:tcW w:type="dxa" w:w="1728"/>
+            <w:tcW w:type="dxa" w:w="2160"/>
             <w:shd w:fill="F5F5F5" w:val="clear"/>
           </w:tcPr>
           <w:p>
@@ -1231,7 +1518,7 @@
       <w:tr>
         <w:tc>
           <w:tcPr>
-            <w:tcW w:type="dxa" w:w="1728"/>
+            <w:tcW w:type="dxa" w:w="2160"/>
           </w:tcPr>
           <w:p>
             <w:pPr>
@@ -1248,7 +1535,7 @@
         </w:tc>
         <w:tc>
           <w:tcPr>
-            <w:tcW w:type="dxa" w:w="1728"/>
+            <w:tcW w:type="dxa" w:w="2160"/>
           </w:tcPr>
           <w:p>
             <w:r/>
@@ -1263,35 +1550,66 @@
         </w:tc>
         <w:tc>
           <w:tcPr>
-            <w:tcW w:type="dxa" w:w="1728"/>
+            <w:tcW w:type="dxa" w:w="2160"/>
           </w:tcPr>
           <w:p>
-            <w:r/>
+            <w:pPr>
+              <w:jc w:val="left"/>
+            </w:pPr>
+            <w:r>
+              <w:rPr>
+                <w:b/>
+                <w:sz w:val="20"/>
+              </w:rPr>
+              <w:t>note</w:t>
+            </w:r>
             <w:r>
               <w:rPr>
                 <w:sz w:val="20"/>
               </w:rPr>
-              <w:t>note + book + -s</w:t>
+              <w:t xml:space="preserve">  —  free</w:t>
+            </w:r>
+          </w:p>
+          <w:p>
+            <w:pPr>
+              <w:jc w:val="left"/>
+            </w:pPr>
+            <w:r>
+              <w:rPr>
+                <w:b/>
+                <w:sz w:val="20"/>
+              </w:rPr>
+              <w:t>book</w:t>
+            </w:r>
+            <w:r>
+              <w:rPr>
+                <w:sz w:val="20"/>
+              </w:rPr>
+              <w:t xml:space="preserve">  —  free</w:t>
+            </w:r>
+          </w:p>
+          <w:p>
+            <w:pPr>
+              <w:jc w:val="left"/>
+            </w:pPr>
+            <w:r>
+              <w:rPr>
+                <w:b/>
+                <w:sz w:val="20"/>
+              </w:rPr>
+              <w:t>-s</w:t>
+            </w:r>
+            <w:r>
+              <w:rPr>
+                <w:sz w:val="20"/>
+              </w:rPr>
+              <w:t xml:space="preserve">  —  bound</w:t>
             </w:r>
           </w:p>
         </w:tc>
         <w:tc>
           <w:tcPr>
-            <w:tcW w:type="dxa" w:w="1728"/>
-          </w:tcPr>
-          <w:p>
-            <w:r/>
-            <w:r>
-              <w:rPr>
-                <w:sz w:val="20"/>
-              </w:rPr>
-              <w:t>free, free, bound</w:t>
-            </w:r>
-          </w:p>
-        </w:tc>
-        <w:tc>
-          <w:tcPr>
-            <w:tcW w:type="dxa" w:w="1728"/>
+            <w:tcW w:type="dxa" w:w="2160"/>
           </w:tcPr>
           <w:p>
             <w:r/>
@@ -1308,7 +1626,7 @@
       <w:tr>
         <w:tc>
           <w:tcPr>
-            <w:tcW w:type="dxa" w:w="1728"/>
+            <w:tcW w:type="dxa" w:w="2160"/>
             <w:shd w:fill="F5F5F5" w:val="clear"/>
           </w:tcPr>
           <w:p>
@@ -1326,7 +1644,7 @@
         </w:tc>
         <w:tc>
           <w:tcPr>
-            <w:tcW w:type="dxa" w:w="1728"/>
+            <w:tcW w:type="dxa" w:w="2160"/>
             <w:shd w:fill="F5F5F5" w:val="clear"/>
           </w:tcPr>
           <w:p>
@@ -1342,37 +1660,67 @@
         </w:tc>
         <w:tc>
           <w:tcPr>
-            <w:tcW w:type="dxa" w:w="1728"/>
+            <w:tcW w:type="dxa" w:w="2160"/>
             <w:shd w:fill="F5F5F5" w:val="clear"/>
           </w:tcPr>
           <w:p>
-            <w:r/>
+            <w:pPr>
+              <w:jc w:val="left"/>
+            </w:pPr>
+            <w:r>
+              <w:rPr>
+                <w:b/>
+                <w:sz w:val="20"/>
+              </w:rPr>
+              <w:t>un-</w:t>
+            </w:r>
             <w:r>
               <w:rPr>
                 <w:sz w:val="20"/>
               </w:rPr>
-              <w:t>un- + lock + -able</w:t>
+              <w:t xml:space="preserve">  —  bound</w:t>
+            </w:r>
+          </w:p>
+          <w:p>
+            <w:pPr>
+              <w:jc w:val="left"/>
+            </w:pPr>
+            <w:r>
+              <w:rPr>
+                <w:b/>
+                <w:sz w:val="20"/>
+              </w:rPr>
+              <w:t>lock</w:t>
+            </w:r>
+            <w:r>
+              <w:rPr>
+                <w:sz w:val="20"/>
+              </w:rPr>
+              <w:t xml:space="preserve">  —  free</w:t>
+            </w:r>
+          </w:p>
+          <w:p>
+            <w:pPr>
+              <w:jc w:val="left"/>
+            </w:pPr>
+            <w:r>
+              <w:rPr>
+                <w:b/>
+                <w:sz w:val="20"/>
+              </w:rPr>
+              <w:t>-able</w:t>
+            </w:r>
+            <w:r>
+              <w:rPr>
+                <w:sz w:val="20"/>
+              </w:rPr>
+              <w:t xml:space="preserve">  —  bound</w:t>
             </w:r>
           </w:p>
         </w:tc>
         <w:tc>
           <w:tcPr>
-            <w:tcW w:type="dxa" w:w="1728"/>
-            <w:shd w:fill="F5F5F5" w:val="clear"/>
-          </w:tcPr>
-          <w:p>
-            <w:r/>
-            <w:r>
-              <w:rPr>
-                <w:sz w:val="20"/>
-              </w:rPr>
-              <w:t>bound, free, bound</w:t>
-            </w:r>
-          </w:p>
-        </w:tc>
-        <w:tc>
-          <w:tcPr>
-            <w:tcW w:type="dxa" w:w="1728"/>
+            <w:tcW w:type="dxa" w:w="2160"/>
             <w:shd w:fill="F5F5F5" w:val="clear"/>
           </w:tcPr>
           <w:p>
@@ -1383,7 +1731,7 @@
       <w:tr>
         <w:tc>
           <w:tcPr>
-            <w:tcW w:type="dxa" w:w="1728"/>
+            <w:tcW w:type="dxa" w:w="2160"/>
           </w:tcPr>
           <w:p>
             <w:pPr>
@@ -1400,7 +1748,7 @@
         </w:tc>
         <w:tc>
           <w:tcPr>
-            <w:tcW w:type="dxa" w:w="1728"/>
+            <w:tcW w:type="dxa" w:w="2160"/>
           </w:tcPr>
           <w:p>
             <w:r/>
@@ -1415,35 +1763,66 @@
         </w:tc>
         <w:tc>
           <w:tcPr>
-            <w:tcW w:type="dxa" w:w="1728"/>
+            <w:tcW w:type="dxa" w:w="2160"/>
           </w:tcPr>
           <w:p>
-            <w:r/>
+            <w:pPr>
+              <w:jc w:val="left"/>
+            </w:pPr>
+            <w:r>
+              <w:rPr>
+                <w:b/>
+                <w:sz w:val="20"/>
+              </w:rPr>
+              <w:t>song</w:t>
+            </w:r>
             <w:r>
               <w:rPr>
                 <w:sz w:val="20"/>
               </w:rPr>
-              <w:t>song + write + -er</w:t>
+              <w:t xml:space="preserve">  —  free</w:t>
+            </w:r>
+          </w:p>
+          <w:p>
+            <w:pPr>
+              <w:jc w:val="left"/>
+            </w:pPr>
+            <w:r>
+              <w:rPr>
+                <w:b/>
+                <w:sz w:val="20"/>
+              </w:rPr>
+              <w:t>write</w:t>
+            </w:r>
+            <w:r>
+              <w:rPr>
+                <w:sz w:val="20"/>
+              </w:rPr>
+              <w:t xml:space="preserve">  —  free</w:t>
+            </w:r>
+          </w:p>
+          <w:p>
+            <w:pPr>
+              <w:jc w:val="left"/>
+            </w:pPr>
+            <w:r>
+              <w:rPr>
+                <w:b/>
+                <w:sz w:val="20"/>
+              </w:rPr>
+              <w:t>-er</w:t>
+            </w:r>
+            <w:r>
+              <w:rPr>
+                <w:sz w:val="20"/>
+              </w:rPr>
+              <w:t xml:space="preserve">  —  bound</w:t>
             </w:r>
           </w:p>
         </w:tc>
         <w:tc>
           <w:tcPr>
-            <w:tcW w:type="dxa" w:w="1728"/>
-          </w:tcPr>
-          <w:p>
-            <w:r/>
-            <w:r>
-              <w:rPr>
-                <w:sz w:val="20"/>
-              </w:rPr>
-              <w:t>free, free, bound</w:t>
-            </w:r>
-          </w:p>
-        </w:tc>
-        <w:tc>
-          <w:tcPr>
-            <w:tcW w:type="dxa" w:w="1728"/>
+            <w:tcW w:type="dxa" w:w="2160"/>
           </w:tcPr>
           <w:p>
             <w:r/>
@@ -1460,7 +1839,7 @@
       <w:tr>
         <w:tc>
           <w:tcPr>
-            <w:tcW w:type="dxa" w:w="1728"/>
+            <w:tcW w:type="dxa" w:w="2160"/>
             <w:shd w:fill="F5F5F5" w:val="clear"/>
           </w:tcPr>
           <w:p>
@@ -1478,7 +1857,7 @@
         </w:tc>
         <w:tc>
           <w:tcPr>
-            <w:tcW w:type="dxa" w:w="1728"/>
+            <w:tcW w:type="dxa" w:w="2160"/>
             <w:shd w:fill="F5F5F5" w:val="clear"/>
           </w:tcPr>
           <w:p>
@@ -1494,37 +1873,67 @@
         </w:tc>
         <w:tc>
           <w:tcPr>
-            <w:tcW w:type="dxa" w:w="1728"/>
+            <w:tcW w:type="dxa" w:w="2160"/>
             <w:shd w:fill="F5F5F5" w:val="clear"/>
           </w:tcPr>
           <w:p>
-            <w:r/>
+            <w:pPr>
+              <w:jc w:val="left"/>
+            </w:pPr>
+            <w:r>
+              <w:rPr>
+                <w:b/>
+                <w:sz w:val="20"/>
+              </w:rPr>
+              <w:t>re-</w:t>
+            </w:r>
             <w:r>
               <w:rPr>
                 <w:sz w:val="20"/>
               </w:rPr>
-              <w:t>re- + play + -able</w:t>
+              <w:t xml:space="preserve">  —  bound</w:t>
+            </w:r>
+          </w:p>
+          <w:p>
+            <w:pPr>
+              <w:jc w:val="left"/>
+            </w:pPr>
+            <w:r>
+              <w:rPr>
+                <w:b/>
+                <w:sz w:val="20"/>
+              </w:rPr>
+              <w:t>play</w:t>
+            </w:r>
+            <w:r>
+              <w:rPr>
+                <w:sz w:val="20"/>
+              </w:rPr>
+              <w:t xml:space="preserve">  —  free</w:t>
+            </w:r>
+          </w:p>
+          <w:p>
+            <w:pPr>
+              <w:jc w:val="left"/>
+            </w:pPr>
+            <w:r>
+              <w:rPr>
+                <w:b/>
+                <w:sz w:val="20"/>
+              </w:rPr>
+              <w:t>-able</w:t>
+            </w:r>
+            <w:r>
+              <w:rPr>
+                <w:sz w:val="20"/>
+              </w:rPr>
+              <w:t xml:space="preserve">  —  bound</w:t>
             </w:r>
           </w:p>
         </w:tc>
         <w:tc>
           <w:tcPr>
-            <w:tcW w:type="dxa" w:w="1728"/>
-            <w:shd w:fill="F5F5F5" w:val="clear"/>
-          </w:tcPr>
-          <w:p>
-            <w:r/>
-            <w:r>
-              <w:rPr>
-                <w:sz w:val="20"/>
-              </w:rPr>
-              <w:t>bound, free, bound</w:t>
-            </w:r>
-          </w:p>
-        </w:tc>
-        <w:tc>
-          <w:tcPr>
-            <w:tcW w:type="dxa" w:w="1728"/>
+            <w:tcW w:type="dxa" w:w="2160"/>
             <w:shd w:fill="F5F5F5" w:val="clear"/>
           </w:tcPr>
           <w:p>
@@ -1535,7 +1944,7 @@
       <w:tr>
         <w:tc>
           <w:tcPr>
-            <w:tcW w:type="dxa" w:w="1728"/>
+            <w:tcW w:type="dxa" w:w="2160"/>
           </w:tcPr>
           <w:p>
             <w:pPr>
@@ -1552,7 +1961,7 @@
         </w:tc>
         <w:tc>
           <w:tcPr>
-            <w:tcW w:type="dxa" w:w="1728"/>
+            <w:tcW w:type="dxa" w:w="2160"/>
           </w:tcPr>
           <w:p>
             <w:r/>
@@ -1567,35 +1976,66 @@
         </w:tc>
         <w:tc>
           <w:tcPr>
-            <w:tcW w:type="dxa" w:w="1728"/>
+            <w:tcW w:type="dxa" w:w="2160"/>
           </w:tcPr>
           <w:p>
-            <w:r/>
+            <w:pPr>
+              <w:jc w:val="left"/>
+            </w:pPr>
+            <w:r>
+              <w:rPr>
+                <w:b/>
+                <w:sz w:val="20"/>
+              </w:rPr>
+              <w:t>un-</w:t>
+            </w:r>
             <w:r>
               <w:rPr>
                 <w:sz w:val="20"/>
               </w:rPr>
-              <w:t>un- + happy + -ness</w:t>
+              <w:t xml:space="preserve">  —  bound</w:t>
+            </w:r>
+          </w:p>
+          <w:p>
+            <w:pPr>
+              <w:jc w:val="left"/>
+            </w:pPr>
+            <w:r>
+              <w:rPr>
+                <w:b/>
+                <w:sz w:val="20"/>
+              </w:rPr>
+              <w:t>happy</w:t>
+            </w:r>
+            <w:r>
+              <w:rPr>
+                <w:sz w:val="20"/>
+              </w:rPr>
+              <w:t xml:space="preserve">  —  free</w:t>
+            </w:r>
+          </w:p>
+          <w:p>
+            <w:pPr>
+              <w:jc w:val="left"/>
+            </w:pPr>
+            <w:r>
+              <w:rPr>
+                <w:b/>
+                <w:sz w:val="20"/>
+              </w:rPr>
+              <w:t>-ness</w:t>
+            </w:r>
+            <w:r>
+              <w:rPr>
+                <w:sz w:val="20"/>
+              </w:rPr>
+              <w:t xml:space="preserve">  —  bound</w:t>
             </w:r>
           </w:p>
         </w:tc>
         <w:tc>
           <w:tcPr>
-            <w:tcW w:type="dxa" w:w="1728"/>
-          </w:tcPr>
-          <w:p>
-            <w:r/>
-            <w:r>
-              <w:rPr>
-                <w:sz w:val="20"/>
-              </w:rPr>
-              <w:t>bound, free, bound</w:t>
-            </w:r>
-          </w:p>
-        </w:tc>
-        <w:tc>
-          <w:tcPr>
-            <w:tcW w:type="dxa" w:w="1728"/>
+            <w:tcW w:type="dxa" w:w="2160"/>
           </w:tcPr>
           <w:p>
             <w:r/>
@@ -1605,7 +2045,7 @@
       <w:tr>
         <w:tc>
           <w:tcPr>
-            <w:tcW w:type="dxa" w:w="1728"/>
+            <w:tcW w:type="dxa" w:w="2160"/>
             <w:shd w:fill="F5F5F5" w:val="clear"/>
           </w:tcPr>
           <w:p>
@@ -1623,7 +2063,7 @@
         </w:tc>
         <w:tc>
           <w:tcPr>
-            <w:tcW w:type="dxa" w:w="1728"/>
+            <w:tcW w:type="dxa" w:w="2160"/>
             <w:shd w:fill="F5F5F5" w:val="clear"/>
           </w:tcPr>
           <w:p>
@@ -1639,37 +2079,67 @@
         </w:tc>
         <w:tc>
           <w:tcPr>
-            <w:tcW w:type="dxa" w:w="1728"/>
+            <w:tcW w:type="dxa" w:w="2160"/>
             <w:shd w:fill="F5F5F5" w:val="clear"/>
           </w:tcPr>
           <w:p>
-            <w:r/>
+            <w:pPr>
+              <w:jc w:val="left"/>
+            </w:pPr>
+            <w:r>
+              <w:rPr>
+                <w:b/>
+                <w:sz w:val="20"/>
+              </w:rPr>
+              <w:t>un-</w:t>
+            </w:r>
             <w:r>
               <w:rPr>
                 <w:sz w:val="20"/>
               </w:rPr>
-              <w:t>un- + predict + -able</w:t>
+              <w:t xml:space="preserve">  —  bound</w:t>
+            </w:r>
+          </w:p>
+          <w:p>
+            <w:pPr>
+              <w:jc w:val="left"/>
+            </w:pPr>
+            <w:r>
+              <w:rPr>
+                <w:b/>
+                <w:sz w:val="20"/>
+              </w:rPr>
+              <w:t>predict</w:t>
+            </w:r>
+            <w:r>
+              <w:rPr>
+                <w:sz w:val="20"/>
+              </w:rPr>
+              <w:t xml:space="preserve">  —  free</w:t>
+            </w:r>
+          </w:p>
+          <w:p>
+            <w:pPr>
+              <w:jc w:val="left"/>
+            </w:pPr>
+            <w:r>
+              <w:rPr>
+                <w:b/>
+                <w:sz w:val="20"/>
+              </w:rPr>
+              <w:t>-able</w:t>
+            </w:r>
+            <w:r>
+              <w:rPr>
+                <w:sz w:val="20"/>
+              </w:rPr>
+              <w:t xml:space="preserve">  —  bound</w:t>
             </w:r>
           </w:p>
         </w:tc>
         <w:tc>
           <w:tcPr>
-            <w:tcW w:type="dxa" w:w="1728"/>
-            <w:shd w:fill="F5F5F5" w:val="clear"/>
-          </w:tcPr>
-          <w:p>
-            <w:r/>
-            <w:r>
-              <w:rPr>
-                <w:sz w:val="20"/>
-              </w:rPr>
-              <w:t>bound, free, bound</w:t>
-            </w:r>
-          </w:p>
-        </w:tc>
-        <w:tc>
-          <w:tcPr>
-            <w:tcW w:type="dxa" w:w="1728"/>
+            <w:tcW w:type="dxa" w:w="2160"/>
             <w:shd w:fill="F5F5F5" w:val="clear"/>
           </w:tcPr>
           <w:p>
@@ -1680,7 +2150,7 @@
       <w:tr>
         <w:tc>
           <w:tcPr>
-            <w:tcW w:type="dxa" w:w="1728"/>
+            <w:tcW w:type="dxa" w:w="2160"/>
           </w:tcPr>
           <w:p>
             <w:pPr>
@@ -1697,7 +2167,7 @@
         </w:tc>
         <w:tc>
           <w:tcPr>
-            <w:tcW w:type="dxa" w:w="1728"/>
+            <w:tcW w:type="dxa" w:w="2160"/>
           </w:tcPr>
           <w:p>
             <w:r/>
@@ -1712,35 +2182,66 @@
         </w:tc>
         <w:tc>
           <w:tcPr>
-            <w:tcW w:type="dxa" w:w="1728"/>
+            <w:tcW w:type="dxa" w:w="2160"/>
           </w:tcPr>
           <w:p>
-            <w:r/>
+            <w:pPr>
+              <w:jc w:val="left"/>
+            </w:pPr>
+            <w:r>
+              <w:rPr>
+                <w:b/>
+                <w:sz w:val="20"/>
+              </w:rPr>
+              <w:t>dis-</w:t>
+            </w:r>
             <w:r>
               <w:rPr>
                 <w:sz w:val="20"/>
               </w:rPr>
-              <w:t>dis- + respect + -ful</w:t>
+              <w:t xml:space="preserve">  —  bound</w:t>
+            </w:r>
+          </w:p>
+          <w:p>
+            <w:pPr>
+              <w:jc w:val="left"/>
+            </w:pPr>
+            <w:r>
+              <w:rPr>
+                <w:b/>
+                <w:sz w:val="20"/>
+              </w:rPr>
+              <w:t>respect</w:t>
+            </w:r>
+            <w:r>
+              <w:rPr>
+                <w:sz w:val="20"/>
+              </w:rPr>
+              <w:t xml:space="preserve">  —  free</w:t>
+            </w:r>
+          </w:p>
+          <w:p>
+            <w:pPr>
+              <w:jc w:val="left"/>
+            </w:pPr>
+            <w:r>
+              <w:rPr>
+                <w:b/>
+                <w:sz w:val="20"/>
+              </w:rPr>
+              <w:t>-ful</w:t>
+            </w:r>
+            <w:r>
+              <w:rPr>
+                <w:sz w:val="20"/>
+              </w:rPr>
+              <w:t xml:space="preserve">  —  bound</w:t>
             </w:r>
           </w:p>
         </w:tc>
         <w:tc>
           <w:tcPr>
-            <w:tcW w:type="dxa" w:w="1728"/>
-          </w:tcPr>
-          <w:p>
-            <w:r/>
-            <w:r>
-              <w:rPr>
-                <w:sz w:val="20"/>
-              </w:rPr>
-              <w:t>bound, free, bound</w:t>
-            </w:r>
-          </w:p>
-        </w:tc>
-        <w:tc>
-          <w:tcPr>
-            <w:tcW w:type="dxa" w:w="1728"/>
+            <w:tcW w:type="dxa" w:w="2160"/>
           </w:tcPr>
           <w:p>
             <w:r/>
@@ -1750,7 +2251,7 @@
       <w:tr>
         <w:tc>
           <w:tcPr>
-            <w:tcW w:type="dxa" w:w="1728"/>
+            <w:tcW w:type="dxa" w:w="2160"/>
             <w:shd w:fill="F5F5F5" w:val="clear"/>
           </w:tcPr>
           <w:p>
@@ -1768,7 +2269,7 @@
         </w:tc>
         <w:tc>
           <w:tcPr>
-            <w:tcW w:type="dxa" w:w="1728"/>
+            <w:tcW w:type="dxa" w:w="2160"/>
             <w:shd w:fill="F5F5F5" w:val="clear"/>
           </w:tcPr>
           <w:p>
@@ -1784,37 +2285,85 @@
         </w:tc>
         <w:tc>
           <w:tcPr>
-            <w:tcW w:type="dxa" w:w="1728"/>
+            <w:tcW w:type="dxa" w:w="2160"/>
             <w:shd w:fill="F5F5F5" w:val="clear"/>
           </w:tcPr>
           <w:p>
-            <w:r/>
+            <w:pPr>
+              <w:jc w:val="left"/>
+            </w:pPr>
+            <w:r>
+              <w:rPr>
+                <w:b/>
+                <w:sz w:val="20"/>
+              </w:rPr>
+              <w:t>dis-</w:t>
+            </w:r>
             <w:r>
               <w:rPr>
                 <w:sz w:val="20"/>
               </w:rPr>
-              <w:t>dis- + agree + -ment + -s</w:t>
+              <w:t xml:space="preserve">  —  bound</w:t>
+            </w:r>
+          </w:p>
+          <w:p>
+            <w:pPr>
+              <w:jc w:val="left"/>
+            </w:pPr>
+            <w:r>
+              <w:rPr>
+                <w:b/>
+                <w:sz w:val="20"/>
+              </w:rPr>
+              <w:t>agree</w:t>
+            </w:r>
+            <w:r>
+              <w:rPr>
+                <w:sz w:val="20"/>
+              </w:rPr>
+              <w:t xml:space="preserve">  —  free</w:t>
+            </w:r>
+          </w:p>
+          <w:p>
+            <w:pPr>
+              <w:jc w:val="left"/>
+            </w:pPr>
+            <w:r>
+              <w:rPr>
+                <w:b/>
+                <w:sz w:val="20"/>
+              </w:rPr>
+              <w:t>-ment</w:t>
+            </w:r>
+            <w:r>
+              <w:rPr>
+                <w:sz w:val="20"/>
+              </w:rPr>
+              <w:t xml:space="preserve">  —  bound</w:t>
+            </w:r>
+          </w:p>
+          <w:p>
+            <w:pPr>
+              <w:jc w:val="left"/>
+            </w:pPr>
+            <w:r>
+              <w:rPr>
+                <w:b/>
+                <w:sz w:val="20"/>
+              </w:rPr>
+              <w:t>-s</w:t>
+            </w:r>
+            <w:r>
+              <w:rPr>
+                <w:sz w:val="20"/>
+              </w:rPr>
+              <w:t xml:space="preserve">  —  bound</w:t>
             </w:r>
           </w:p>
         </w:tc>
         <w:tc>
           <w:tcPr>
-            <w:tcW w:type="dxa" w:w="1728"/>
-            <w:shd w:fill="F5F5F5" w:val="clear"/>
-          </w:tcPr>
-          <w:p>
-            <w:r/>
-            <w:r>
-              <w:rPr>
-                <w:sz w:val="20"/>
-              </w:rPr>
-              <w:t>bound, free, bound, bound</w:t>
-            </w:r>
-          </w:p>
-        </w:tc>
-        <w:tc>
-          <w:tcPr>
-            <w:tcW w:type="dxa" w:w="1728"/>
+            <w:tcW w:type="dxa" w:w="2160"/>
             <w:shd w:fill="F5F5F5" w:val="clear"/>
           </w:tcPr>
           <w:p>

</xml_diff>